<commit_message>
Format the generated file
</commit_message>
<xml_diff>
--- a/result_formatted.docx
+++ b/result_formatted.docx
@@ -278,7 +278,7 @@
         <w:widowControl/>
         <w:spacing w:line="200" w:lineRule="exact" w:before="386" w:after="0"/>
         <w:ind w:left="2112" w:right="0" w:firstLine="0"/>
-        <w:jc w:val="both"/>
+        <w:jc w:val="left"/>
       </w:pPr>
       <w:r>
         <w:rPr>
@@ -1046,7 +1046,7 @@
         <w:widowControl/>
         <w:spacing w:line="200" w:lineRule="exact" w:before="464" w:after="0"/>
         <w:ind w:left="0" w:right="4638" w:firstLine="0"/>
-        <w:jc w:val="both"/>
+        <w:jc w:val="right"/>
       </w:pPr>
       <w:r>
         <w:rPr>
@@ -9660,7 +9660,7 @@
         <w:widowControl/>
         <w:spacing w:line="200" w:lineRule="exact" w:before="438" w:after="0"/>
         <w:ind w:left="0" w:right="0" w:firstLine="0"/>
-        <w:jc w:val="left"/>
+        <w:jc w:val="center"/>
       </w:pPr>
       <w:r>
         <w:rPr>
@@ -9743,7 +9743,7 @@
         <w:widowControl/>
         <w:spacing w:line="218" w:lineRule="exact" w:before="238" w:after="0"/>
         <w:ind w:left="714" w:right="720" w:firstLine="6"/>
-        <w:jc w:val="center"/>
+        <w:jc w:val="both"/>
       </w:pPr>
       <w:r>
         <w:rPr>
@@ -9827,7 +9827,7 @@
         <w:widowControl/>
         <w:spacing w:line="210" w:lineRule="exact" w:before="158" w:after="0"/>
         <w:ind w:left="0" w:right="0" w:firstLine="0"/>
-        <w:jc w:val="center"/>
+        <w:jc w:val="both"/>
       </w:pPr>
       <w:r>
         <w:rPr>
@@ -9871,7 +9871,7 @@
       </w:pPr>
       <w:r>
         <w:rPr>
-          <w:rFonts w:ascii="" w:hAnsi="" w:eastAsia=""/>
+          <w:rFonts w:ascii="Times New Roman" w:hAnsi="Times New Roman" w:eastAsia="Times New Roman"/>
           <w:b w:val="0"/>
           <w:i w:val="0"/>
           <w:color w:val="000000"/>
@@ -9882,7 +9882,7 @@
       <w:r>
         <w:rPr>
           <w:w w:val="98.82577896118164"/>
-          <w:rFonts w:ascii="" w:hAnsi="" w:eastAsia=""/>
+          <w:rFonts w:ascii="Times New Roman" w:hAnsi="Times New Roman" w:eastAsia="Times New Roman"/>
           <w:b w:val="0"/>
           <w:i w:val="0"/>
           <w:color w:val="000000"/>
@@ -9892,7 +9892,7 @@
       </w:r>
       <w:r>
         <w:rPr>
-          <w:rFonts w:ascii="" w:hAnsi="" w:eastAsia=""/>
+          <w:rFonts w:ascii="Times New Roman" w:hAnsi="Times New Roman" w:eastAsia="Times New Roman"/>
           <w:b w:val="0"/>
           <w:i w:val="0"/>
           <w:color w:val="000000"/>
@@ -9902,7 +9902,7 @@
       </w:r>
       <w:r>
         <w:rPr>
-          <w:rFonts w:ascii="" w:hAnsi="" w:eastAsia=""/>
+          <w:rFonts w:ascii="Times New Roman" w:hAnsi="Times New Roman" w:eastAsia="Times New Roman"/>
           <w:b w:val="0"/>
           <w:i w:val="0"/>
           <w:color w:val="000000"/>
@@ -9912,7 +9912,7 @@
       </w:r>
       <w:r>
         <w:rPr>
-          <w:rFonts w:ascii="" w:hAnsi="" w:eastAsia=""/>
+          <w:rFonts w:ascii="Times New Roman" w:hAnsi="Times New Roman" w:eastAsia="Times New Roman"/>
           <w:b w:val="0"/>
           <w:i w:val="0"/>
           <w:color w:val="000000"/>
@@ -9923,7 +9923,7 @@
       <w:r>
         <w:rPr>
           <w:w w:val="98.62470626831055"/>
-          <w:rFonts w:ascii="" w:hAnsi="" w:eastAsia=""/>
+          <w:rFonts w:ascii="Times New Roman" w:hAnsi="Times New Roman" w:eastAsia="Times New Roman"/>
           <w:b w:val="0"/>
           <w:i w:val="0"/>
           <w:color w:val="000000"/>
@@ -9933,7 +9933,7 @@
       </w:r>
       <w:r>
         <w:rPr>
-          <w:rFonts w:ascii="" w:hAnsi="" w:eastAsia=""/>
+          <w:rFonts w:ascii="Times New Roman" w:hAnsi="Times New Roman" w:eastAsia="Times New Roman"/>
           <w:b w:val="0"/>
           <w:i w:val="0"/>
           <w:color w:val="000000"/>
@@ -10016,7 +10016,7 @@
       </w:pPr>
       <w:r>
         <w:rPr>
-          <w:rFonts w:ascii="" w:hAnsi="" w:eastAsia=""/>
+          <w:rFonts w:ascii="Times New Roman" w:hAnsi="Times New Roman" w:eastAsia="Times New Roman"/>
           <w:b w:val="0"/>
           <w:i w:val="0"/>
           <w:color w:val="000000"/>
@@ -10026,7 +10026,7 @@
       </w:r>
       <w:r>
         <w:rPr>
-          <w:rFonts w:ascii="" w:hAnsi="" w:eastAsia=""/>
+          <w:rFonts w:ascii="Times New Roman" w:hAnsi="Times New Roman" w:eastAsia="Times New Roman"/>
           <w:b w:val="0"/>
           <w:i w:val="0"/>
           <w:color w:val="000000"/>
@@ -10036,7 +10036,7 @@
       </w:r>
       <w:r>
         <w:rPr>
-          <w:rFonts w:ascii="" w:hAnsi="" w:eastAsia=""/>
+          <w:rFonts w:ascii="Times New Roman" w:hAnsi="Times New Roman" w:eastAsia="Times New Roman"/>
           <w:b w:val="0"/>
           <w:i w:val="0"/>
           <w:color w:val="000000"/>
@@ -10052,7 +10052,7 @@
         <w:widowControl/>
         <w:spacing w:line="230" w:lineRule="exact" w:before="108" w:after="0"/>
         <w:ind w:left="576" w:right="576" w:firstLine="0"/>
-        <w:jc w:val="center"/>
+        <w:jc w:val="both"/>
       </w:pPr>
       <w:r>
         <m:oMath>
@@ -10121,7 +10121,7 @@
         <w:widowControl/>
         <w:spacing w:line="200" w:lineRule="exact" w:before="398" w:after="0"/>
         <w:ind w:left="0" w:right="0" w:firstLine="0"/>
-        <w:jc w:val="both"/>
+        <w:jc w:val="center"/>
       </w:pPr>
       <w:r>
         <w:rPr>
@@ -10160,7 +10160,7 @@
         <w:widowControl/>
         <w:spacing w:line="220" w:lineRule="exact" w:before="26" w:after="0"/>
         <w:ind w:left="720" w:right="720" w:firstLine="0"/>
-        <w:jc w:val="left"/>
+        <w:jc w:val="both"/>
       </w:pPr>
       <w:r>
         <w:t xml:space="preserve">encoder of Wan-VAE encodes it from pixel space into the latent space </w:t>
@@ -10330,7 +10330,7 @@
         <w:widowControl/>
         <w:spacing w:line="218" w:lineRule="exact" w:before="0" w:after="0"/>
         <w:ind w:left="576" w:right="0" w:firstLine="0"/>
-        <w:jc w:val="center"/>
+        <w:jc w:val="both"/>
       </w:pPr>
       <w:r>
         <w:t xml:space="preserve">Diffusion transformer. The diffusion transformer mainly consists of three components: a patchifying module, trans-former blocks, and an unpatchifying module. Within each block, we focus on effectively modeling spatio-temporal contextual relationships and embedding text conditions alongside time steps. </w:t>
@@ -10565,7 +10565,7 @@
         <w:widowControl/>
         <w:spacing w:line="210" w:lineRule="exact" w:before="216" w:after="276"/>
         <w:ind w:left="158" w:right="0" w:firstLine="0"/>
-        <w:jc w:val="center"/>
+        <w:jc w:val="both"/>
       </w:pPr>
       <w:r>
         <w:rPr>
@@ -10624,7 +10624,7 @@
       <w:r>
         <w:rPr>
           <w:w w:val="98.62470626831055"/>
-          <w:rFonts w:ascii="" w:hAnsi="" w:eastAsia=""/>
+          <w:rFonts w:ascii="Times New Roman" w:hAnsi="Times New Roman" w:eastAsia="Times New Roman"/>
           <w:b w:val="0"/>
           <w:i w:val="0"/>
           <w:color w:val="000000"/>
@@ -10644,7 +10644,7 @@
       </w:r>
       <w:r>
         <w:rPr>
-          <w:rFonts w:ascii="" w:hAnsi="" w:eastAsia=""/>
+          <w:rFonts w:ascii="Times New Roman" w:hAnsi="Times New Roman" w:eastAsia="Times New Roman"/>
           <w:b w:val="0"/>
           <w:i w:val="0"/>
           <w:color w:val="000000"/>
@@ -10654,7 +10654,7 @@
       </w:r>
       <w:r>
         <w:rPr>
-          <w:rFonts w:ascii="" w:hAnsi="" w:eastAsia=""/>
+          <w:rFonts w:ascii="Times New Roman" w:hAnsi="Times New Roman" w:eastAsia="Times New Roman"/>
           <w:b w:val="0"/>
           <w:i w:val="0"/>
           <w:color w:val="000000"/>
@@ -10670,7 +10670,7 @@
         <w:widowControl/>
         <w:spacing w:line="218" w:lineRule="exact" w:before="122" w:after="0"/>
         <w:ind w:left="718" w:right="576" w:hanging="6"/>
-        <w:jc w:val="left"/>
+        <w:jc w:val="both"/>
       </w:pPr>
       <w:r>
         <w:t xml:space="preserve">Text encoder. Wan’s architecture uses the umT5 (Chung </w:t>
@@ -10822,7 +10822,7 @@
         <w:widowControl/>
         <w:spacing w:line="220" w:lineRule="exact" w:before="172" w:after="0"/>
         <w:ind w:left="720" w:right="576" w:hanging="10"/>
-        <w:jc w:val="left"/>
+        <w:jc w:val="both"/>
       </w:pPr>
       <w:r>
         <m:oMath>
@@ -10946,7 +10946,7 @@
         <w:widowControl/>
         <w:spacing w:line="224" w:lineRule="exact" w:before="116" w:after="0"/>
         <w:ind w:left="720" w:right="576" w:hanging="6"/>
-        <w:jc w:val="left"/>
+        <w:jc w:val="both"/>
       </w:pPr>
       <w:r>
         <w:t xml:space="preserve">Training objective. Flow matching provides a theoretically grounded framework for learning continuous-time generative processes in diffusion models. </w:t>
@@ -11320,7 +11320,7 @@
         <w:widowControl/>
         <w:spacing w:line="418" w:lineRule="exact" w:before="0" w:after="0"/>
         <w:ind w:left="714" w:right="576" w:firstLine="0"/>
-        <w:jc w:val="left"/>
+        <w:jc w:val="both"/>
       </w:pPr>
       <w:r>
         <w:t xml:space="preserve">The groud truth velocity </w:t>
@@ -11489,7 +11489,7 @@
         <w:widowControl/>
         <w:spacing w:line="232" w:lineRule="exact" w:before="50" w:after="0"/>
         <w:ind w:left="720" w:right="720" w:hanging="6"/>
-        <w:jc w:val="left"/>
+        <w:jc w:val="both"/>
       </w:pPr>
       <w:r>
         <w:t xml:space="preserve">The model is trained to predict the velocity, thus, the loss function can be formulated as the mean squared error (MSE) between the model output and </w:t>
@@ -11521,7 +11521,7 @@
         <w:widowControl/>
         <w:spacing w:line="200" w:lineRule="exact" w:before="386" w:after="0"/>
         <w:ind w:left="0" w:right="0" w:firstLine="0"/>
-        <w:jc w:val="both"/>
+        <w:jc w:val="center"/>
       </w:pPr>
       <w:r>
         <w:rPr>
@@ -11785,7 +11785,7 @@
         <w:widowControl/>
         <w:spacing w:line="202" w:lineRule="exact" w:before="180" w:after="0"/>
         <w:ind w:left="720" w:right="720" w:hanging="8"/>
-        <w:jc w:val="left"/>
+        <w:jc w:val="both"/>
       </w:pPr>
       <w:r>
         <w:t xml:space="preserve">where </w:t>
@@ -11957,7 +11957,7 @@
       <w:r>
         <w:rPr>
           <w:w w:val="98.87598037719727"/>
-          <w:rFonts w:ascii="" w:hAnsi="" w:eastAsia=""/>
+          <w:rFonts w:ascii="Times New Roman" w:hAnsi="Times New Roman" w:eastAsia="Times New Roman"/>
           <w:b/>
           <w:i w:val="0"/>
           <w:color w:val="000000"/>
@@ -11968,7 +11968,7 @@
       <w:r>
         <w:rPr>
           <w:w w:val="98.87598037719727"/>
-          <w:rFonts w:ascii="" w:hAnsi="" w:eastAsia=""/>
+          <w:rFonts w:ascii="Times New Roman" w:hAnsi="Times New Roman" w:eastAsia="Times New Roman"/>
           <w:b w:val="0"/>
           <w:i w:val="0"/>
           <w:color w:val="000000"/>
@@ -11988,7 +11988,7 @@
       </w:r>
       <w:r>
         <w:rPr>
-          <w:rFonts w:ascii="CMMI10" w:hAnsi="CMMI10" w:eastAsia="CMMI10"/>
+          <w:rFonts w:ascii="Times New Roman" w:hAnsi="Times New Roman" w:eastAsia="Times New Roman"/>
           <w:b w:val="0"/>
           <w:i/>
           <w:color w:val="000000"/>
@@ -11999,7 +11999,7 @@
       <w:r>
         <w:rPr>
           <w:w w:val="98.87598037719727"/>
-          <w:rFonts w:ascii="" w:hAnsi="" w:eastAsia=""/>
+          <w:rFonts w:ascii="Times New Roman" w:hAnsi="Times New Roman" w:eastAsia="Times New Roman"/>
           <w:b w:val="0"/>
           <w:i w:val="0"/>
           <w:color w:val="000000"/>
@@ -12009,7 +12009,7 @@
       </w:r>
       <w:r>
         <w:rPr>
-          <w:rFonts w:ascii="" w:hAnsi="" w:eastAsia=""/>
+          <w:rFonts w:ascii="Times New Roman" w:hAnsi="Times New Roman" w:eastAsia="Times New Roman"/>
           <w:b w:val="0"/>
           <w:i w:val="0"/>
           <w:color w:val="000000"/>
@@ -12019,7 +12019,7 @@
       </w:r>
       <w:r>
         <w:rPr>
-          <w:rFonts w:ascii="" w:hAnsi="" w:eastAsia=""/>
+          <w:rFonts w:ascii="Times New Roman" w:hAnsi="Times New Roman" w:eastAsia="Times New Roman"/>
           <w:b w:val="0"/>
           <w:i w:val="0"/>
           <w:color w:val="000000"/>
@@ -12030,7 +12030,7 @@
       <w:r>
         <w:rPr>
           <w:w w:val="98.62470626831055"/>
-          <w:rFonts w:ascii="" w:hAnsi="" w:eastAsia=""/>
+          <w:rFonts w:ascii="Times New Roman" w:hAnsi="Times New Roman" w:eastAsia="Times New Roman"/>
           <w:b w:val="0"/>
           <w:i w:val="0"/>
           <w:color w:val="000000"/>
@@ -12050,7 +12050,7 @@
       </w:r>
       <w:r>
         <w:rPr>
-          <w:rFonts w:ascii="CMMI10" w:hAnsi="CMMI10" w:eastAsia="CMMI10"/>
+          <w:rFonts w:ascii="Times New Roman" w:hAnsi="Times New Roman" w:eastAsia="Times New Roman"/>
           <w:b w:val="0"/>
           <w:i/>
           <w:color w:val="000000"/>
@@ -12061,7 +12061,7 @@
       <w:r>
         <w:rPr>
           <w:w w:val="98.62470626831055"/>
-          <w:rFonts w:ascii="" w:hAnsi="" w:eastAsia=""/>
+          <w:rFonts w:ascii="Times New Roman" w:hAnsi="Times New Roman" w:eastAsia="Times New Roman"/>
           <w:b w:val="0"/>
           <w:i w:val="0"/>
           <w:color w:val="000000"/>
@@ -12081,7 +12081,7 @@
       </w:r>
       <w:r>
         <w:rPr>
-          <w:rFonts w:ascii="CMMI10" w:hAnsi="CMMI10" w:eastAsia="CMMI10"/>
+          <w:rFonts w:ascii="Times New Roman" w:hAnsi="Times New Roman" w:eastAsia="Times New Roman"/>
           <w:b w:val="0"/>
           <w:i/>
           <w:color w:val="000000"/>
@@ -12091,7 +12091,7 @@
       </w:r>
       <w:r>
         <w:rPr>
-          <w:rFonts w:ascii="" w:hAnsi="" w:eastAsia=""/>
+          <w:rFonts w:ascii="Times New Roman" w:hAnsi="Times New Roman" w:eastAsia="Times New Roman"/>
           <w:b w:val="0"/>
           <w:i w:val="0"/>
           <w:color w:val="000000"/>
@@ -12111,7 +12111,7 @@
       </w:r>
       <w:r>
         <w:rPr>
-          <w:rFonts w:ascii="" w:hAnsi="" w:eastAsia=""/>
+          <w:rFonts w:ascii="Times New Roman" w:hAnsi="Times New Roman" w:eastAsia="Times New Roman"/>
           <w:b w:val="0"/>
           <w:i w:val="0"/>
           <w:color w:val="000000"/>
@@ -12121,7 +12121,7 @@
       </w:r>
       <w:r>
         <w:rPr>
-          <w:rFonts w:ascii="" w:hAnsi="" w:eastAsia=""/>
+          <w:rFonts w:ascii="Times New Roman" w:hAnsi="Times New Roman" w:eastAsia="Times New Roman"/>
           <w:b w:val="0"/>
           <w:i w:val="0"/>
           <w:color w:val="000000"/>
@@ -12141,7 +12141,7 @@
       </w:r>
       <w:r>
         <w:rPr>
-          <w:rFonts w:ascii="CMMI10" w:hAnsi="CMMI10" w:eastAsia="CMMI10"/>
+          <w:rFonts w:ascii="Times New Roman" w:hAnsi="Times New Roman" w:eastAsia="Times New Roman"/>
           <w:b w:val="0"/>
           <w:i/>
           <w:color w:val="000000"/>
@@ -12151,7 +12151,7 @@
       </w:r>
       <w:r>
         <w:rPr>
-          <w:rFonts w:ascii="" w:hAnsi="" w:eastAsia=""/>
+          <w:rFonts w:ascii="Times New Roman" w:hAnsi="Times New Roman" w:eastAsia="Times New Roman"/>
           <w:b w:val="0"/>
           <w:i w:val="0"/>
           <w:color w:val="000000"/>
@@ -12161,7 +12161,7 @@
       </w:r>
       <w:r>
         <w:rPr>
-          <w:rFonts w:ascii="" w:hAnsi="" w:eastAsia=""/>
+          <w:rFonts w:ascii="Times New Roman" w:hAnsi="Times New Roman" w:eastAsia="Times New Roman"/>
           <w:b w:val="0"/>
           <w:i w:val="0"/>
           <w:color w:val="000000"/>
@@ -12181,7 +12181,7 @@
       </w:r>
       <w:r>
         <w:rPr>
-          <w:rFonts w:ascii="CMMI10" w:hAnsi="CMMI10" w:eastAsia="CMMI10"/>
+          <w:rFonts w:ascii="Times New Roman" w:hAnsi="Times New Roman" w:eastAsia="Times New Roman"/>
           <w:b w:val="0"/>
           <w:i/>
           <w:color w:val="000000"/>
@@ -12191,7 +12191,7 @@
       </w:r>
       <w:r>
         <w:rPr>
-          <w:rFonts w:ascii="" w:hAnsi="" w:eastAsia=""/>
+          <w:rFonts w:ascii="Times New Roman" w:hAnsi="Times New Roman" w:eastAsia="Times New Roman"/>
           <w:b w:val="0"/>
           <w:i w:val="0"/>
           <w:color w:val="000000"/>
@@ -12535,7 +12535,7 @@
         <w:widowControl/>
         <w:spacing w:line="220" w:lineRule="exact" w:before="192" w:after="0"/>
         <w:ind w:left="720" w:right="576" w:firstLine="0"/>
-        <w:jc w:val="left"/>
+        <w:jc w:val="both"/>
       </w:pPr>
       <w:r>
         <m:oMath>
@@ -12674,7 +12674,7 @@
         <w:widowControl/>
         <w:spacing w:line="220" w:lineRule="exact" w:before="120" w:after="0"/>
         <w:ind w:left="720" w:right="576" w:firstLine="0"/>
-        <w:jc w:val="left"/>
+        <w:jc w:val="both"/>
       </w:pPr>
       <w:r>
         <w:t xml:space="preserve">During the training process, only the DiT model is optimized while the text encoder and the VAE encoder remain frozen. Therefore, GPU memory usage is concentrated on training the DiT. The GPU memory usage for the DiT can be expressed as </w:t>
@@ -12775,7 +12775,7 @@
         <w:widowControl/>
         <w:spacing w:line="200" w:lineRule="exact" w:before="398" w:after="0"/>
         <w:ind w:left="0" w:right="0" w:firstLine="0"/>
-        <w:jc w:val="both"/>
+        <w:jc w:val="center"/>
       </w:pPr>
       <w:r>
         <w:rPr>

</xml_diff>